<commit_message>
Bỏ nhãn "EnQuiz" khỏi bài giảng, thay bằng dấu ấn đơn vị đào tạo
Chân trang slide, lời đọc và nội dung slide trước đó ghi "EnQuiz" (tên ứng
dụng) — không đúng tinh thần Điều 18 (dấu ấn ĐƠN VỊ ĐÀO TẠO ở chân trang,
không phải tên một ứng dụng con). Đổi chân trang ba hàm render ở
tools/_mau_slide_on_tap.py thành "ĐH Công nghệ Kỹ thuật Vĩnh Long · Khởi sự
doanh nghiệp (EC1606)"; đổi lời đọc nhắc làm trắc nghiệm trong
docs/kich_ban_on_tap.json và docs/slide_noi_dung.json từ "trong EnQuiz"
thành "trong ứng dụng ôn tập"; sửa chú thích tương ứng trong
tools/dung_video_on_tap.py. Dựng lại toàn bộ 83 ảnh slide, 5 video, docx/pdf
kịch bản qua tools/dung_video_on_tap.py; nâng CACHE_VERSION trong sw.js.
</commit_message>
<xml_diff>
--- a/on-tap-video/kich-ban/KICH_BAN_THUYET_MINH__ON_TAP_EC1606.docx
+++ b/on-tap-video/kich-ban/KICH_BAN_THUYET_MINH__ON_TAP_EC1606.docx
@@ -116,7 +116,7 @@
           <w:i w:val="0"/>
           <w:sz w:val="22"/>
         </w:rPr>
-        <w:t>• Thời lượng ước tính ở mỗi slide tính theo tốc độ 206 từ/phút — con số này ĐO THẬT từ bản thu của chính tác giả ở ec6035tx-chuong-5 (ComDraft), KHÔNG PHẢI đo trên giọng đọc thật của bộ kịch bản này (EnQuiz chưa có bản thu thật). Dùng để tham khảo khi quay, cần đối chiếu lại tốc độ đọc thật sau khi có bản thu đầu tiên.</w:t>
+        <w:t>• Thời lượng ước tính ở mỗi slide tính theo tốc độ 206 từ/phút — con số này ĐO THẬT từ bản thu của chính tác giả ở ec6035tx-chuong-5 (ComDraft), KHÔNG PHẢI đo trên giọng đọc thật của bộ kịch bản này (bộ kịch bản này chưa có bản thu thật). Dùng để tham khảo khi quay, cần đối chiếu lại tốc độ đọc thật sau khi có bản thu đầu tiên.</w:t>
       </w:r>
     </w:p>
     <w:p>
@@ -155,7 +155,7 @@
           <w:i w:val="0"/>
           <w:sz w:val="22"/>
         </w:rPr>
-        <w:t>• Mỗi video từ Video 2 trở đi mở bằng một câu nhắc lại ý chính chương trước, rồi mới vào nội dung chương mới; mỗi video khép bằng một đoạn hệ thống hóa 5 câu hỏi tự kiểm tra và lời nhắc làm 60 câu trắc nghiệm của chương đó trong EnQuiz.</w:t>
+        <w:t>• Mỗi video từ Video 2 trở đi mở bằng một câu nhắc lại ý chính chương trước, rồi mới vào nội dung chương mới; mỗi video khép bằng một đoạn hệ thống hóa 5 câu hỏi tự kiểm tra và lời nhắc ôn lại bằng ngân hàng 60 câu hỏi trắc nghiệm của chương đó.</w:t>
       </w:r>
     </w:p>
     <w:p>
@@ -286,7 +286,7 @@
           </w:tcPr>
           <w:p>
             <w:r>
-              <w:t>~13 phút 04</w:t>
+              <w:t>~13 phút 05</w:t>
             </w:r>
           </w:p>
         </w:tc>
@@ -328,7 +328,7 @@
           </w:tcPr>
           <w:p>
             <w:r>
-              <w:t>~12 phút 15</w:t>
+              <w:t>~12 phút 16</w:t>
             </w:r>
           </w:p>
         </w:tc>
@@ -412,7 +412,7 @@
           </w:tcPr>
           <w:p>
             <w:r>
-              <w:t>~12 phút 05</w:t>
+              <w:t>~12 phút 06</w:t>
             </w:r>
           </w:p>
         </w:tc>
@@ -488,7 +488,7 @@
           <w:i/>
           <w:sz w:val="22"/>
         </w:rPr>
-        <w:t>(19 slide, ước tính 13 phút 04)</w:t>
+        <w:t>(19 slide, ước tính 13 phút 05)</w:t>
       </w:r>
     </w:p>
     <w:p>
@@ -969,7 +969,7 @@
           <w:i w:val="0"/>
           <w:sz w:val="22"/>
         </w:rPr>
-        <w:t>SLIDE 19 – LÀM 60 CÂU TRẮC NGHIỆM CHƯƠNG 1   (~10 giây)</w:t>
+        <w:t>SLIDE 19 – LÀM 60 CÂU TRẮC NGHIỆM CHƯƠNG 1   (~11 giây)</w:t>
       </w:r>
     </w:p>
     <w:p>
@@ -982,7 +982,7 @@
           <w:i w:val="0"/>
           <w:sz w:val="22"/>
         </w:rPr>
-        <w:t>Các bạn hãy làm 60 câu trắc nghiệm của Chương một trong EnQuiz để tự kiểm tra lại kiến thức nhé. Hẹn gặp lại các bạn ở video ôn tập Chương hai.</w:t>
+        <w:t>Các bạn hãy làm 60 câu trắc nghiệm của Chương một trong ứng dụng ôn tập để tự kiểm tra lại kiến thức nhé. Hẹn gặp lại các bạn ở video ôn tập Chương hai.</w:t>
       </w:r>
     </w:p>
     <w:p>
@@ -1013,7 +1013,7 @@
           <w:i/>
           <w:sz w:val="22"/>
         </w:rPr>
-        <w:t>(18 slide, ước tính 12 phút 15)</w:t>
+        <w:t>(18 slide, ước tính 12 phút 16)</w:t>
       </w:r>
     </w:p>
     <w:p>
@@ -1468,7 +1468,7 @@
           <w:i w:val="0"/>
           <w:sz w:val="22"/>
         </w:rPr>
-        <w:t>SLIDE 18 – LÀM 60 CÂU TRẮC NGHIỆM CHƯƠNG 2   (~22 giây)</w:t>
+        <w:t>SLIDE 18 – LÀM 60 CÂU TRẮC NGHIỆM CHƯƠNG 2   (~23 giây)</w:t>
       </w:r>
     </w:p>
     <w:p>
@@ -1481,7 +1481,7 @@
           <w:i w:val="0"/>
           <w:sz w:val="22"/>
         </w:rPr>
-        <w:t>Các bạn hãy làm 60 câu trắc nghiệm Chương hai trong EnQuiz để tự đánh giá nhé, và khi làm bài, cố gắng nhớ lại ví dụ chị Hoa hoặc ví dụ gốm đỏ mà chúng ta vừa phân tích — việc gắn kiến thức với một tình huống cụ thể thường giúp nhớ lâu hơn là học thuộc định nghĩa suông. Hẹn gặp lại ở video ôn tập Chương ba.</w:t>
+        <w:t>Các bạn hãy làm 60 câu trắc nghiệm Chương hai trong ứng dụng ôn tập để tự đánh giá nhé, và khi làm bài, cố gắng nhớ lại ví dụ chị Hoa hoặc ví dụ gốm đỏ mà chúng ta vừa phân tích — việc gắn kiến thức với một tình huống cụ thể thường giúp nhớ lâu hơn là học thuộc định nghĩa suông. Hẹn gặp lại ở video ôn tập Chương ba.</w:t>
       </w:r>
     </w:p>
     <w:p>
@@ -1959,7 +1959,7 @@
           <w:i/>
           <w:sz w:val="22"/>
         </w:rPr>
-        <w:t>(15 slide, ước tính 12 phút 05)</w:t>
+        <w:t>(15 slide, ước tính 12 phút 06)</w:t>
       </w:r>
     </w:p>
     <w:p>
@@ -2336,7 +2336,7 @@
           <w:i w:val="0"/>
           <w:sz w:val="22"/>
         </w:rPr>
-        <w:t>SLIDE 15 – LÀM 60 CÂU TRẮC NGHIỆM CHƯƠNG 4   (~17 giây)</w:t>
+        <w:t>SLIDE 15 – LÀM 60 CÂU TRẮC NGHIỆM CHƯƠNG 4   (~18 giây)</w:t>
       </w:r>
     </w:p>
     <w:p>
@@ -2349,7 +2349,7 @@
           <w:i w:val="0"/>
           <w:sz w:val="22"/>
         </w:rPr>
-        <w:t>Các bạn hãy làm 60 câu trắc nghiệm Chương bốn trong EnQuiz nhé, đặc biệt chú ý phân biệt trách nhiệm hữu hạn và vô hạn giữa các loại hình — đây là điểm hay bị nhầm lẫn nhất trong các đề thi. Hẹn gặp lại ở Chương năm — Marketing cho doanh nghiệp mới.</w:t>
+        <w:t>Các bạn hãy làm 60 câu trắc nghiệm Chương bốn trong ứng dụng ôn tập nhé, đặc biệt chú ý phân biệt trách nhiệm hữu hạn và vô hạn giữa các loại hình — đây là điểm hay bị nhầm lẫn nhất trong các đề thi. Hẹn gặp lại ở Chương năm — Marketing cho doanh nghiệp mới.</w:t>
       </w:r>
     </w:p>
     <w:p>

</xml_diff>